<commit_message>
ZSH2.0 V0.8.2 add PublicKey Save
</commit_message>
<xml_diff>
--- a/core/update/package/中石化_2.0_B2400/使用说明.docx
+++ b/core/update/package/中石化_2.0_B2400/使用说明.docx
@@ -31,6 +31,7 @@
     <w:p>
       <w:pPr>
         <w:numPr>
+          <w:ilvl w:val="0"/>
           <w:numId w:val="0"/>
         </w:numPr>
         <w:ind w:firstLine="420" w:firstLineChars="0"/>
@@ -44,31 +45,15 @@
           <w:rFonts w:hint="eastAsia"/>
           <w:lang w:val="en-US" w:eastAsia="zh-CN"/>
         </w:rPr>
-        <w:t xml:space="preserve">killall </w:t>
-      </w:r>
-      <w:r>
-        <w:rPr>
-          <w:rFonts w:hint="default"/>
-          <w:lang w:val="en-US" w:eastAsia="zh-CN"/>
-        </w:rPr>
-        <w:t>daemon &amp;&amp; killall zk_comm &amp;&amp; killall tcu_daemon</w:t>
-      </w:r>
+        <w:t>killall tcu_daemon zk_comm daemon</w:t>
+      </w:r>
+      <w:bookmarkStart w:id="0" w:name="_GoBack"/>
+      <w:bookmarkEnd w:id="0"/>
     </w:p>
     <w:p>
       <w:pPr>
         <w:numPr>
-          <w:numId w:val="0"/>
-        </w:numPr>
-        <w:ind w:firstLine="420" w:firstLineChars="0"/>
-        <w:rPr>
-          <w:rFonts w:hint="default"/>
-          <w:lang w:val="en-US" w:eastAsia="zh-CN"/>
-        </w:rPr>
-      </w:pPr>
-    </w:p>
-    <w:p>
-      <w:pPr>
-        <w:numPr>
+          <w:ilvl w:val="0"/>
           <w:numId w:val="0"/>
         </w:numPr>
         <w:rPr>
@@ -191,6 +176,7 @@
     <w:p>
       <w:pPr>
         <w:numPr>
+          <w:ilvl w:val="0"/>
           <w:numId w:val="0"/>
         </w:numPr>
         <w:ind w:leftChars="0"/>
@@ -210,6 +196,7 @@
     <w:p>
       <w:pPr>
         <w:numPr>
+          <w:ilvl w:val="0"/>
           <w:numId w:val="0"/>
         </w:numPr>
         <w:ind w:leftChars="0" w:firstLine="420" w:firstLineChars="0"/>
@@ -230,6 +217,7 @@
       <w:pPr>
         <w:widowControl w:val="0"/>
         <w:numPr>
+          <w:ilvl w:val="0"/>
           <w:numId w:val="0"/>
         </w:numPr>
         <w:ind w:firstLine="420" w:firstLineChars="0"/>
@@ -251,6 +239,7 @@
       <w:pPr>
         <w:widowControl w:val="0"/>
         <w:numPr>
+          <w:ilvl w:val="0"/>
           <w:numId w:val="0"/>
         </w:numPr>
         <w:jc w:val="both"/>
@@ -306,6 +295,7 @@
       <w:pPr>
         <w:widowControl w:val="0"/>
         <w:numPr>
+          <w:ilvl w:val="0"/>
           <w:numId w:val="0"/>
         </w:numPr>
         <w:jc w:val="both"/>
@@ -363,6 +353,7 @@
       <w:pPr>
         <w:widowControl w:val="0"/>
         <w:numPr>
+          <w:ilvl w:val="0"/>
           <w:numId w:val="0"/>
         </w:numPr>
         <w:jc w:val="both"/>
@@ -376,6 +367,7 @@
       <w:pPr>
         <w:widowControl w:val="0"/>
         <w:numPr>
+          <w:ilvl w:val="0"/>
           <w:numId w:val="0"/>
         </w:numPr>
         <w:jc w:val="both"/>
@@ -391,8 +383,6 @@
         </w:rPr>
         <w:t>注意，目前平台app上显示是否离线的逻辑有问题，当充电桩屏幕显示上线后，如手机app仍为离线状态，则需手动插枪一次，平台就会恢复正常状态。</w:t>
       </w:r>
-      <w:bookmarkStart w:id="0" w:name="_GoBack"/>
-      <w:bookmarkEnd w:id="0"/>
     </w:p>
     <w:sectPr>
       <w:pgSz w:w="11906" w:h="16838"/>

</xml_diff>